<commit_message>
feat(client): about and skills layer stack
</commit_message>
<xml_diff>
--- a/client/public/cv/Vishal_Sharma_CV.docx
+++ b/client/public/cv/Vishal_Sharma_CV.docx
@@ -19,7 +19,7 @@
         <w:t xml:space="preserve">BTech Computer Science · JK Lakshmipat University</w:t>
       </w:r>
       <w:r>
-        <w:t xml:space="preserve"> | Jaipur, India | Student</w:t>
+        <w:t xml:space="preserve"> | Jaipur, Rajasthan, India | Computer Science and Engineering student / software developer</w:t>
       </w:r>
     </w:p>
     <w:p/>
@@ -51,10 +51,10 @@
           <w:b/>
           <w:bCs/>
         </w:rPr>
-        <w:t xml:space="preserve">Interface (Frontend): </w:t>
-      </w:r>
-      <w:r>
-        <w:t xml:space="preserve">React (Intermediate), JavaScript (Advanced), HTML &amp; CSS (Advanced)</w:t>
+        <w:t xml:space="preserve">Languages &amp; Foundations (Core Engineering): </w:t>
+      </w:r>
+      <w:r>
+        <w:t xml:space="preserve">Java (Advanced), C++ (Intermediate), JavaScript (Advanced), Python (Intermediate), SQL (Intermediate), HTML5 (Advanced), CSS3 (Advanced)</w:t>
       </w:r>
     </w:p>
     <w:p>
@@ -63,10 +63,10 @@
           <w:b/>
           <w:bCs/>
         </w:rPr>
-        <w:t xml:space="preserve">Service (Backend): </w:t>
-      </w:r>
-      <w:r>
-        <w:t xml:space="preserve">Java (Intermediate), Spring Boot (Intermediate), Node.js (Intermediate), Express.js (Intermediate), PostgreSQL (Intermediate), MongoDB (Intermediate)</w:t>
+        <w:t xml:space="preserve">Backend &amp; Databases (Services &amp; Storage): </w:t>
+      </w:r>
+      <w:r>
+        <w:t xml:space="preserve">Spring Boot (Intermediate), Node.js (Intermediate), Express.js (Intermediate), REST APIs (Advanced), PostgreSQL (Intermediate), MySQL (Intermediate), MongoDB (Intermediate), Mongoose (Intermediate), JWT Authentication (Intermediate), Spring Security (Intermediate)</w:t>
       </w:r>
     </w:p>
     <w:p>
@@ -75,10 +75,10 @@
           <w:b/>
           <w:bCs/>
         </w:rPr>
-        <w:t xml:space="preserve">Foundation (Tools &amp; Technologies): </w:t>
-      </w:r>
-      <w:r>
-        <w:t xml:space="preserve">Git &amp; GitHub (Advanced)</w:t>
+        <w:t xml:space="preserve">Frontend, Tools &amp; Engineering (Interface &amp; Delivery): </w:t>
+      </w:r>
+      <w:r>
+        <w:t xml:space="preserve">React (Intermediate), Tailwind CSS (Intermediate), Git (Advanced), GitHub (Advanced), Maven (Intermediate), Postman (Intermediate), Practical AI Integration (Intermediate)</w:t>
       </w:r>
     </w:p>
     <w:sectPr>

</xml_diff>

<commit_message>
feat(client): redesign skills section with technology cards
</commit_message>
<xml_diff>
--- a/client/public/cv/Vishal_Sharma_CV.docx
+++ b/client/public/cv/Vishal_Sharma_CV.docx
@@ -51,10 +51,10 @@
           <w:b/>
           <w:bCs/>
         </w:rPr>
-        <w:t xml:space="preserve">Languages &amp; Foundations (Core Engineering): </w:t>
-      </w:r>
-      <w:r>
-        <w:t xml:space="preserve">Java (Advanced), C++ (Intermediate), JavaScript (Advanced), Python (Intermediate), SQL (Intermediate), HTML5 (Advanced), CSS3 (Advanced)</w:t>
+        <w:t xml:space="preserve">Languages (Core Engineering): </w:t>
+      </w:r>
+      <w:r>
+        <w:t xml:space="preserve">Java, C++, JavaScript, Python, SQL</w:t>
       </w:r>
     </w:p>
     <w:p>
@@ -63,10 +63,10 @@
           <w:b/>
           <w:bCs/>
         </w:rPr>
-        <w:t xml:space="preserve">Backend &amp; Databases (Services &amp; Storage): </w:t>
-      </w:r>
-      <w:r>
-        <w:t xml:space="preserve">Spring Boot (Intermediate), Node.js (Intermediate), Express.js (Intermediate), REST APIs (Advanced), PostgreSQL (Intermediate), MySQL (Intermediate), MongoDB (Intermediate), Mongoose (Intermediate), JWT Authentication (Intermediate), Spring Security (Intermediate)</w:t>
+        <w:t xml:space="preserve">Frontend (User Interface): </w:t>
+      </w:r>
+      <w:r>
+        <w:t xml:space="preserve">React, HTML5, CSS3, Tailwind CSS</w:t>
       </w:r>
     </w:p>
     <w:p>
@@ -75,10 +75,22 @@
           <w:b/>
           <w:bCs/>
         </w:rPr>
-        <w:t xml:space="preserve">Frontend, Tools &amp; Engineering (Interface &amp; Delivery): </w:t>
-      </w:r>
-      <w:r>
-        <w:t xml:space="preserve">React (Intermediate), Tailwind CSS (Intermediate), Git (Advanced), GitHub (Advanced), Maven (Intermediate), Postman (Intermediate), Practical AI Integration (Intermediate)</w:t>
+        <w:t xml:space="preserve">Backend &amp; Databases (Services &amp; Storage): </w:t>
+      </w:r>
+      <w:r>
+        <w:t xml:space="preserve">Spring Boot, Node.js, Express.js, REST APIs, PostgreSQL, MySQL, MongoDB, Mongoose, Spring Security, JWT Authentication</w:t>
+      </w:r>
+    </w:p>
+    <w:p>
+      <w:r>
+        <w:rPr>
+          <w:b/>
+          <w:bCs/>
+        </w:rPr>
+        <w:t xml:space="preserve">Tools &amp; Engineering (Tooling &amp; Workflow): </w:t>
+      </w:r>
+      <w:r>
+        <w:t xml:space="preserve">Git, GitHub, Maven, Postman, Practical AI Integration</w:t>
       </w:r>
     </w:p>
     <w:sectPr>

</xml_diff>